<commit_message>
feat(diagram): auto-detect layout topology per site
</commit_message>
<xml_diff>
--- a/backend/assets/seattle-logical.docx
+++ b/backend/assets/seattle-logical.docx
@@ -6,7 +6,7 @@
       <w:r>
         <w:drawing>
           <wp:inline xmlns:a="http://schemas.openxmlformats.org/drawingml/2006/main" xmlns:pic="http://schemas.openxmlformats.org/drawingml/2006/picture">
-            <wp:extent cx="9692640" cy="9789106"/>
+            <wp:extent cx="9692640" cy="13700411"/>
             <wp:docPr id="1" name="Picture 1"/>
             <wp:cNvGraphicFramePr>
               <a:graphicFrameLocks noChangeAspect="1"/>
@@ -27,7 +27,7 @@
                   <pic:spPr>
                     <a:xfrm>
                       <a:off x="0" y="0"/>
-                      <a:ext cx="9692640" cy="9789106"/>
+                      <a:ext cx="9692640" cy="13700411"/>
                     </a:xfrm>
                     <a:prstGeom prst="rect"/>
                   </pic:spPr>
@@ -47,7 +47,7 @@
       <w:r>
         <w:drawing>
           <wp:inline xmlns:a="http://schemas.openxmlformats.org/drawingml/2006/main" xmlns:pic="http://schemas.openxmlformats.org/drawingml/2006/picture">
-            <wp:extent cx="9692640" cy="8276672"/>
+            <wp:extent cx="9692640" cy="7657925"/>
             <wp:docPr id="2" name="Picture 2"/>
             <wp:cNvGraphicFramePr>
               <a:graphicFrameLocks noChangeAspect="1"/>
@@ -68,7 +68,7 @@
                   <pic:spPr>
                     <a:xfrm>
                       <a:off x="0" y="0"/>
-                      <a:ext cx="9692640" cy="8276672"/>
+                      <a:ext cx="9692640" cy="7657925"/>
                     </a:xfrm>
                     <a:prstGeom prst="rect"/>
                   </pic:spPr>

</xml_diff>

<commit_message>
fix(diagram): accurate text measurement, pin VSDX font, add vsdx validation test
</commit_message>
<xml_diff>
--- a/backend/assets/seattle-logical.docx
+++ b/backend/assets/seattle-logical.docx
@@ -170,7 +170,7 @@
       <w:r>
         <w:drawing>
           <wp:inline xmlns:a="http://schemas.openxmlformats.org/drawingml/2006/main" xmlns:pic="http://schemas.openxmlformats.org/drawingml/2006/picture">
-            <wp:extent cx="9692640" cy="7180982"/>
+            <wp:extent cx="9692640" cy="3958444"/>
             <wp:docPr id="5" name="Picture 5"/>
             <wp:cNvGraphicFramePr>
               <a:graphicFrameLocks noChangeAspect="1"/>
@@ -191,7 +191,7 @@
                   <pic:spPr>
                     <a:xfrm>
                       <a:off x="0" y="0"/>
-                      <a:ext cx="9692640" cy="7180982"/>
+                      <a:ext cx="9692640" cy="3958444"/>
                     </a:xfrm>
                     <a:prstGeom prst="rect"/>
                   </pic:spPr>
@@ -252,7 +252,7 @@
       <w:r>
         <w:drawing>
           <wp:inline xmlns:a="http://schemas.openxmlformats.org/drawingml/2006/main" xmlns:pic="http://schemas.openxmlformats.org/drawingml/2006/picture">
-            <wp:extent cx="9692640" cy="4115525"/>
+            <wp:extent cx="9692640" cy="3958444"/>
             <wp:docPr id="7" name="Picture 7"/>
             <wp:cNvGraphicFramePr>
               <a:graphicFrameLocks noChangeAspect="1"/>
@@ -273,7 +273,7 @@
                   <pic:spPr>
                     <a:xfrm>
                       <a:off x="0" y="0"/>
-                      <a:ext cx="9692640" cy="4115525"/>
+                      <a:ext cx="9692640" cy="3958444"/>
                     </a:xfrm>
                     <a:prstGeom prst="rect"/>
                   </pic:spPr>

</xml_diff>